<commit_message>
Count a hit within 1 m so a correct first pass usually scores.
About 9 in 10 careful one-pass solutions land inside that window. The old 0.01 m line rejected most of them.
</commit_message>
<xml_diff>
--- a/Vector-Fleet-Firing-Angles.docx
+++ b/Vector-Fleet-Firing-Angles.docx
@@ -1660,7 +1660,7 @@
           <w:sz w:val="22"/>
           <w:szCs w:val="22"/>
         </w:rPr>
-        <w:t xml:space="preserve">If this time is not the time you used in step 6, the target is not where you aimed. Repeat steps 6 through 9 with the new time. Stop when the time stops changing. The board counts a hit only within 0.01 m. One pass, which is all the old sheet did before the solver, usually lands about 0.2 m off and sometimes more than a meter off. Two or three repeats is typical. The old step was to compare your angles with the solver. This repeat is that check.</w:t>
+        <w:t>If this time is not the time you used in step 6, the target is not where you aimed. Repeat steps 6 through 9 with the new time. Stop when the time stops changing. The board counts a hit within 1 m, and one careful pass usually lands inside that window. When the new time is quite different from the time you used, repeat steps 6 through 9. A second pass covers most of the shots the first pass leaves outside 1 m.</w:t>
       </w:r>
     </w:p>
     <w:p>
@@ -2443,7 +2443,7 @@
           <w:sz w:val="22"/>
           <w:szCs w:val="22"/>
         </w:rPr>
-        <w:t xml:space="preserve">The time from this new elevation is about 1.153 s, not 1.245 s. That first pass misses by about 0.23 m, outside the 0.01 m window. Repeat steps 6 through 9 with the new time. When the time stops changing, enter elevation </w:t>
+        <w:t xml:space="preserve">The time from this new elevation is about 1.153 s, not 1.245 s. That first pass is about 0.23 m off the ship, inside the 1 m window, so elevation 11.64° and direction 31.73° already hit. Repeating until the time settles gives elevation </w:t>
       </w:r>
       <w:r>
         <w:rPr>

</xml_diff>

<commit_message>
Widen the board to 200 m and raise the muzzle to 35 m/s.
The still-water range is 125 m, so some targets stay out of reach while a correct first pass still lands inside 1 m. The map is drawn across the full span, and the handout example adds the same current to both ships.
</commit_message>
<xml_diff>
--- a/Vector-Fleet-Firing-Angles.docx
+++ b/Vector-Fleet-Firing-Angles.docx
@@ -38,7 +38,7 @@
           <w:sz w:val="22"/>
           <w:szCs w:val="22"/>
         </w:rPr>
-        <w:t xml:space="preserve">Same procedure as before, with the current added to each ship’s movement</w:t>
+        <w:t xml:space="preserve">A 200 m field and a 35 m/s gun. Current is added to each ship’s movement.</w:t>
       </w:r>
     </w:p>
     <w:p>
@@ -56,7 +56,7 @@
           <w:sz w:val="22"/>
           <w:szCs w:val="22"/>
         </w:rPr>
-        <w:t xml:space="preserve">Every ship fires at 28.00 m/s. Use g = 9.8 m/s², and use meters. 0° points along +x (right) and 90° points along +y (up). For a vector of speed v at angle θ, the components are v</w:t>
+        <w:t xml:space="preserve">Every ship fires at 35.00 m/s. Use g = 9.8 m/s², and use meters. The map runs from −100 m to 100 m. 0° points along +x (right) and 90° points along +y (up). For a vector of speed v at angle θ, the components are v</w:t>
       </w:r>
       <w:r>
         <w:rPr>
@@ -110,7 +110,7 @@
           <w:sz w:val="22"/>
           <w:szCs w:val="22"/>
         </w:rPr>
-        <w:t xml:space="preserve"> = v sin θ.</w:t>
+        <w:t xml:space="preserve"> = v sin θ. A hit is a splash within 1 m of the target.</w:t>
       </w:r>
     </w:p>
     <w:p>
@@ -123,7 +123,7 @@
           <wp:inline distT="0" distB="0" distL="0" distR="0">
             <wp:extent cx="6572250" cy="3533775"/>
             <wp:effectExtent t="0" r="0" b="0" l="0"/>
-            <wp:docPr id="1" name="Vector correction diagram" descr="Top view: dashed initial line from your ship S to the target T, then arrows for the opposite of your movement, the target movement, and the opposite of the wind. Their sum is the solid final-range arrow at direction phi. Side view: elevation alpha above the water, with range R." title="Figure 1. Where to aim"/>
+            <wp:docPr id="1" name="Vector correction diagram" descr="Top view of the initial distance and the three corrections, and a side view of the 35 m/s elevation." title="Figure 1. Where to aim"/>
             <wp:cNvGraphicFramePr>
               <a:graphicFrameLocks xmlns:a="http://schemas.openxmlformats.org/drawingml/2006/main" noChangeAspect="1"/>
             </wp:cNvGraphicFramePr>
@@ -187,7 +187,7 @@
           <w:sz w:val="20"/>
           <w:szCs w:val="20"/>
         </w:rPr>
-        <w:t xml:space="preserve"> The dashed line is the initial distance. The three arrows are the corrections in step 6. The solid arrow is the direction you fire. The side view is the elevation. The drawing is the setup, not a scale picture of one round.</w:t>
+        <w:t xml:space="preserve"> The dashed line is the initial distance. The three arrows are the corrections in step 6. The solid arrow is the direction you fire. The side view is the elevation.</w:t>
       </w:r>
     </w:p>
     <w:p>
@@ -289,7 +289,7 @@
           <w:sz w:val="22"/>
           <w:szCs w:val="22"/>
         </w:rPr>
-        <w:t xml:space="preserve">² / g = 28.00² / 9.8 = 80.00 m</w:t>
+        <w:t xml:space="preserve">² / g = 35.00² / 9.8 = 125.00 m</w:t>
       </w:r>
     </w:p>
     <w:p>
@@ -307,7 +307,7 @@
           <w:sz w:val="22"/>
           <w:szCs w:val="22"/>
         </w:rPr>
-        <w:t xml:space="preserve">That estimate ignores motion and wind. A target whose initial distance is near 80 m can move out of range once you correct it.</w:t>
+        <w:t xml:space="preserve">That estimate ignores motion and wind. A target near 125 m can move out of range once you correct it.</w:t>
       </w:r>
     </w:p>
     <w:p>
@@ -609,7 +609,7 @@
           <w:sz w:val="22"/>
           <w:szCs w:val="22"/>
         </w:rPr>
-        <w:t xml:space="preserve">(d × 9.8 / 784)</w:t>
+        <w:t xml:space="preserve">(d × 9.8 / 1225)</w:t>
       </w:r>
     </w:p>
     <w:p>
@@ -691,7 +691,7 @@
           <w:sz w:val="22"/>
           <w:szCs w:val="22"/>
         </w:rPr>
-        <w:t xml:space="preserve"> = 28.00 cos θ</w:t>
+        <w:t xml:space="preserve"> = 35.00 cos θ</w:t>
       </w:r>
     </w:p>
     <w:p>
@@ -801,7 +801,7 @@
           <w:sz w:val="22"/>
           <w:szCs w:val="22"/>
         </w:rPr>
-        <w:t xml:space="preserve"> The old sheet had no current. Add it to each ship’s heading before you use the movement. θ</w:t>
+        <w:t xml:space="preserve"> Add the current to each ship’s heading before you use the movement. θ</w:t>
       </w:r>
       <w:r>
         <w:rPr>
@@ -1155,7 +1155,7 @@
           <w:sz w:val="22"/>
           <w:szCs w:val="22"/>
         </w:rPr>
-        <w:t xml:space="preserve">Do that for your ship and for the target. The wind is separate. Fire at where the target will be, not where it is now. The target’s movement is added. Your movement and the wind are compensated by adding the opposite of each component. Multiply those velocities by the time, then add them to the target’s initial coordinates:</w:t>
+        <w:t xml:space="preserve">Do that for your ship and for the target. The wind is separate. The target’s movement is added. Your movement and the wind are compensated by adding the opposite of each component:</w:t>
       </w:r>
     </w:p>
     <w:p>
@@ -1432,39 +1432,20 @@
           <w:sz w:val="22"/>
           <w:szCs w:val="22"/>
         </w:rPr>
-        <w:t xml:space="preserve">Find the new distance.</w:t>
-      </w:r>
-      <w:r>
-        <w:rPr>
-          <w:rFonts w:ascii="Arial" w:cs="Arial" w:eastAsia="Arial" w:hAnsi="Arial"/>
-          <w:b w:val="false"/>
-          <w:bCs w:val="false"/>
-          <w:i w:val="false"/>
-          <w:iCs w:val="false"/>
-          <w:color w:val="222222"/>
-          <w:sz w:val="22"/>
-          <w:szCs w:val="22"/>
-        </w:rPr>
-        <w:t xml:space="preserve"> Use the differences between your ship and the new aim point (x′, y′).</w:t>
-      </w:r>
-    </w:p>
-    <w:p>
-      <w:pPr>
-        <w:spacing w:before="40" w:after="40" w:line="276"/>
-        <w:ind w:left="420"/>
-      </w:pPr>
-      <w:r>
-        <w:rPr>
-          <w:rFonts w:ascii="Arial" w:cs="Arial" w:eastAsia="Arial" w:hAnsi="Arial"/>
-          <w:b w:val="false"/>
-          <w:bCs w:val="false"/>
-          <w:i/>
-          <w:iCs/>
-          <w:color w:val="222222"/>
-          <w:sz w:val="22"/>
-          <w:szCs w:val="22"/>
-        </w:rPr>
-        <w:t xml:space="preserve">d = √(x² + y²)</w:t>
+        <w:t xml:space="preserve">Find the new distance</w:t>
+      </w:r>
+      <w:r>
+        <w:rPr>
+          <w:rFonts w:ascii="Arial" w:cs="Arial" w:eastAsia="Arial" w:hAnsi="Arial"/>
+          <w:b w:val="false"/>
+          <w:bCs w:val="false"/>
+          <w:i w:val="false"/>
+          <w:iCs w:val="false"/>
+          <w:color w:val="222222"/>
+          <w:sz w:val="22"/>
+          <w:szCs w:val="22"/>
+        </w:rPr>
+        <w:t xml:space="preserve"> from your ship to the aim point (x′, y′), with d = √(x² + y²).</w:t>
       </w:r>
     </w:p>
     <w:p>
@@ -1587,7 +1568,7 @@
           <w:sz w:val="22"/>
           <w:szCs w:val="22"/>
         </w:rPr>
-        <w:t xml:space="preserve">x and y are the same differences you just used for the distance. The calculator’s inverse tangent does not know the quadrant. If x is negative, add 180°. If the calculator gives a negative angle and x is positive, add 360° instead. Adding 180° in that case aims the wrong way. You may also type the negative angle; the board reads −20° as 340°.</w:t>
+        <w:t xml:space="preserve">x and y are the differences between you and the aim point. If x is negative, add 180°. If the calculator gives a negative angle and x is positive, add 360° instead. Adding 180° in that case aims the wrong way. You may also type the negative angle. The board reads −20° as 340°.</w:t>
       </w:r>
     </w:p>
     <w:p>
@@ -1610,75 +1591,38 @@
           <w:sz w:val="22"/>
           <w:szCs w:val="22"/>
         </w:rPr>
-        <w:t xml:space="preserve">Check the time, and repeat if it changed.</w:t>
-      </w:r>
-      <w:r>
-        <w:rPr>
-          <w:rFonts w:ascii="Arial" w:cs="Arial" w:eastAsia="Arial" w:hAnsi="Arial"/>
-          <w:b w:val="false"/>
-          <w:bCs w:val="false"/>
-          <w:i w:val="false"/>
-          <w:iCs w:val="false"/>
-          <w:color w:val="222222"/>
-          <w:sz w:val="22"/>
-          <w:szCs w:val="22"/>
-        </w:rPr>
-        <w:t xml:space="preserve"> Find the time again from the new distance and the new elevation:</w:t>
-      </w:r>
-    </w:p>
-    <w:p>
-      <w:pPr>
-        <w:spacing w:before="40" w:after="40" w:line="276"/>
-        <w:ind w:left="420"/>
-      </w:pPr>
-      <w:r>
-        <w:rPr>
-          <w:rFonts w:ascii="Arial" w:cs="Arial" w:eastAsia="Arial" w:hAnsi="Arial"/>
-          <w:b w:val="false"/>
-          <w:bCs w:val="false"/>
-          <w:i/>
-          <w:iCs/>
-          <w:color w:val="222222"/>
-          <w:sz w:val="22"/>
-          <w:szCs w:val="22"/>
-        </w:rPr>
-        <w:t xml:space="preserve">t = d / (28.00 cos θ)</w:t>
-      </w:r>
-    </w:p>
-    <w:p>
-      <w:pPr>
-        <w:spacing w:before="0" w:after="120" w:line="276"/>
-      </w:pPr>
-      <w:r>
-        <w:rPr>
-          <w:rFonts w:ascii="Arial" w:cs="Arial" w:eastAsia="Arial" w:hAnsi="Arial"/>
-          <w:b w:val="false"/>
-          <w:bCs w:val="false"/>
-          <w:i w:val="false"/>
-          <w:iCs w:val="false"/>
-          <w:color w:val="222222"/>
-          <w:sz w:val="22"/>
-          <w:szCs w:val="22"/>
-        </w:rPr>
-        <w:t>If this time is not the time you used in step 6, the target is not where you aimed. Repeat steps 6 through 9 with the new time. Stop when the time stops changing. The board counts a hit within 1 m, and one careful pass usually lands inside that window. When the new time is quite different from the time you used, repeat steps 6 through 9. A second pass covers most of the shots the first pass leaves outside 1 m.</w:t>
-      </w:r>
-    </w:p>
-    <w:p>
-      <w:pPr>
-        <w:spacing w:before="80" w:after="120" w:line="276"/>
-      </w:pPr>
-      <w:r>
-        <w:rPr>
-          <w:rFonts w:ascii="Arial" w:cs="Arial" w:eastAsia="Arial" w:hAnsi="Arial"/>
-          <w:b w:val="false"/>
-          <w:bCs w:val="false"/>
-          <w:i w:val="false"/>
-          <w:iCs w:val="false"/>
-          <w:color w:val="222222"/>
-          <w:sz w:val="22"/>
-          <w:szCs w:val="22"/>
-        </w:rPr>
-        <w:t xml:space="preserve">Type the elevation in Elev ° and the direction in Dir °. Keep at least two decimals, and a third digit when you have it. This procedure gives the low gun angle. The high gun angle is 90° minus that angle, and it needs its own time and its own repeat, because the target moves farther during the longer flight.</w:t>
+        <w:t xml:space="preserve">Check the time, and repeat if you missed.</w:t>
+      </w:r>
+      <w:r>
+        <w:rPr>
+          <w:rFonts w:ascii="Arial" w:cs="Arial" w:eastAsia="Arial" w:hAnsi="Arial"/>
+          <w:b w:val="false"/>
+          <w:bCs w:val="false"/>
+          <w:i w:val="false"/>
+          <w:iCs w:val="false"/>
+          <w:color w:val="222222"/>
+          <w:sz w:val="22"/>
+          <w:szCs w:val="22"/>
+        </w:rPr>
+        <w:t xml:space="preserve"> Find the time again from the new distance and the new elevation, t = d / (35.00 cos θ). A careful first pass usually lands inside the 1 m window. When this new time is quite different from the time you used, repeat steps 6 through 9. A second pass covers most of the shots the first pass leaves outside 1 m.</w:t>
+      </w:r>
+    </w:p>
+    <w:p>
+      <w:pPr>
+        <w:spacing w:before="60" w:after="120" w:line="276"/>
+      </w:pPr>
+      <w:r>
+        <w:rPr>
+          <w:rFonts w:ascii="Arial" w:cs="Arial" w:eastAsia="Arial" w:hAnsi="Arial"/>
+          <w:b w:val="false"/>
+          <w:bCs w:val="false"/>
+          <w:i w:val="false"/>
+          <w:iCs w:val="false"/>
+          <w:color w:val="222222"/>
+          <w:sz w:val="22"/>
+          <w:szCs w:val="22"/>
+        </w:rPr>
+        <w:t xml:space="preserve">Type the elevation in Elev ° and the direction in Dir °. Keep two decimal places. This procedure gives the low gun angle. The high gun angle is 90° minus that angle, and it needs its own time.</w:t>
       </w:r>
     </w:p>
     <w:p>
@@ -1716,7 +1660,7 @@
           <w:sz w:val="22"/>
           <w:szCs w:val="22"/>
         </w:rPr>
-        <w:t xml:space="preserve">You are at (0.00, 0.00) m and Blue is at (40.00, 0.00) m. Headings, current, and wind are all zero. The distance is 40.00 m, which is inside 80 m. sin(2θ) = 40.00 × 9.8 / 784 = 0.500, so the low elevation is 15.00°. The horizontal speed is 28.00 cos 15.00°, and the time is 1.479 s. Nothing is added in step 6, so the new distance is still 40.00 m, the elevation is still 15.00°, and the direction is 0.00°. The time does not change. Enter elevation </w:t>
+        <w:t xml:space="preserve">You are at (0.00, 0.00) m and Blue is at (62.50, 0.00) m. Headings, current, and wind are zero. sin(2θ) = 62.50 × 9.8 / 1225 = 0.500, so the low elevation is 15.00°. The time is 1.849 s. Nothing is added in step 6, so the distance stays 62.50 m and the direction is 0.00°. Enter elevation </w:t>
       </w:r>
       <w:r>
         <w:rPr>
@@ -1806,25 +1750,7 @@
           <w:sz w:val="22"/>
           <w:szCs w:val="22"/>
         </w:rPr>
-        <w:t xml:space="preserve">You are at (4.00, −2.00) m with heading 2.00 m/s @ 0.00°. Blue is at (34.00, 14.00) m with heading 1.00 m/s @ 90.00°. The current is 0.50 m/s @ 90.00°. The wind is 1.00 m/s @ 0.00°.</w:t>
-      </w:r>
-    </w:p>
-    <w:p>
-      <w:pPr>
-        <w:spacing w:before="0" w:after="60" w:line="276"/>
-      </w:pPr>
-      <w:r>
-        <w:rPr>
-          <w:rFonts w:ascii="Arial" w:cs="Arial" w:eastAsia="Arial" w:hAnsi="Arial"/>
-          <w:b w:val="false"/>
-          <w:bCs w:val="false"/>
-          <w:i w:val="false"/>
-          <w:iCs w:val="false"/>
-          <w:color w:val="222222"/>
-          <w:sz w:val="22"/>
-          <w:szCs w:val="22"/>
-        </w:rPr>
-        <w:t xml:space="preserve">Differences: x = 30.00 m, y = 16.00 m. Distance = 34.00 m.</w:t>
+        <w:t xml:space="preserve">You are at (4.00, −2.00) m with heading 2.00 m/s @ 0.00°. Blue is at (34.00, 14.00) m with heading 1.00 m/s @ 90.00°. The current is 0.50 m/s @ 90.00°. The wind is 1.00 m/s @ 0.00°. The differences are x = 30.00 m and y = 16.00 m, so the distance is 34.00 m.</w:t>
       </w:r>
     </w:p>
     <w:p>
@@ -2168,7 +2094,7 @@
                 <w:sz w:val="20"/>
                 <w:szCs w:val="20"/>
               </w:rPr>
-              <w:t xml:space="preserve">0.50</w:t>
+              <w:t xml:space="preserve">0.00</w:t>
             </w:r>
           </w:p>
         </w:tc>
@@ -2205,7 +2131,7 @@
                 <w:sz w:val="20"/>
                 <w:szCs w:val="20"/>
               </w:rPr>
-              <w:t xml:space="preserve">1.00</w:t>
+              <w:t xml:space="preserve">1.50</w:t>
             </w:r>
           </w:p>
         </w:tc>
@@ -2342,7 +2268,7 @@
           <w:sz w:val="22"/>
           <w:szCs w:val="22"/>
         </w:rPr>
-        <w:t xml:space="preserve">The first elevation is 12.58°, the horizontal speed gives t = 1.245 s, and the aim point moves to</w:t>
+        <w:t xml:space="preserve">The first elevation is 7.89° and the time is 0.981 s. The aim point moves to</w:t>
       </w:r>
     </w:p>
     <w:p>
@@ -2361,7 +2287,7 @@
           <w:sz w:val="22"/>
           <w:szCs w:val="22"/>
         </w:rPr>
-        <w:t xml:space="preserve">x′ = 34.00 + (0.50 − 2.00 − 1.00)(1.245) = 30.888 m</w:t>
+        <w:t xml:space="preserve">x′ = 34.00 + (0.00 − 2.00 − 1.00)(0.981) = 31.06 m</w:t>
       </w:r>
     </w:p>
     <w:p>
@@ -2380,7 +2306,7 @@
           <w:sz w:val="22"/>
           <w:szCs w:val="22"/>
         </w:rPr>
-        <w:t xml:space="preserve">y′ = 14.00 + (1.00 − 0.50 − 0.00)(1.245) = 14.622 m</w:t>
+        <w:t xml:space="preserve">y′ = 14.00 + (1.50 − 0.50 − 0.00)(0.981) = 14.98 m</w:t>
       </w:r>
     </w:p>
     <w:p>
@@ -2398,52 +2324,7 @@
           <w:sz w:val="22"/>
           <w:szCs w:val="22"/>
         </w:rPr>
-        <w:t xml:space="preserve">From you at (4.00, −2.00), the new differences are x = 26.888 m and y = 16.622 m. The new distance is 31.61 m, the new elevation is about 11.64°, and the direction is tan</w:t>
-      </w:r>
-      <w:r>
-        <w:rPr>
-          <w:rFonts w:ascii="Arial" w:cs="Arial" w:eastAsia="Arial" w:hAnsi="Arial"/>
-          <w:b w:val="false"/>
-          <w:bCs w:val="false"/>
-          <w:i w:val="false"/>
-          <w:iCs w:val="false"/>
-          <w:color w:val="222222"/>
-          <w:sz w:val="22"/>
-          <w:szCs w:val="22"/>
-          <w:vertAlign w:val="superscript"/>
-        </w:rPr>
-        <w:t xml:space="preserve">−1</w:t>
-      </w:r>
-      <w:r>
-        <w:rPr>
-          <w:rFonts w:ascii="Arial" w:cs="Arial" w:eastAsia="Arial" w:hAnsi="Arial"/>
-          <w:b w:val="false"/>
-          <w:bCs w:val="false"/>
-          <w:i w:val="false"/>
-          <w:iCs w:val="false"/>
-          <w:color w:val="222222"/>
-          <w:sz w:val="22"/>
-          <w:szCs w:val="22"/>
-        </w:rPr>
-        <w:t xml:space="preserve">(16.622 / 26.888) = 31.73°. Both differences are positive, so do not add 180°.</w:t>
-      </w:r>
-    </w:p>
-    <w:p>
-      <w:pPr>
-        <w:spacing w:before="0" w:after="120" w:line="276"/>
-      </w:pPr>
-      <w:r>
-        <w:rPr>
-          <w:rFonts w:ascii="Arial" w:cs="Arial" w:eastAsia="Arial" w:hAnsi="Arial"/>
-          <w:b w:val="false"/>
-          <w:bCs w:val="false"/>
-          <w:i w:val="false"/>
-          <w:iCs w:val="false"/>
-          <w:color w:val="222222"/>
-          <w:sz w:val="22"/>
-          <w:szCs w:val="22"/>
-        </w:rPr>
-        <w:t xml:space="preserve">The time from this new elevation is about 1.153 s, not 1.245 s. That first pass is about 0.23 m off the ship, inside the 1 m window, so elevation 11.64° and direction 31.73° already hit. Repeating until the time settles gives elevation </w:t>
+        <w:t xml:space="preserve">From you at (4.00, −2.00), the new differences are x = 27.06 m and y = 16.98 m. The new distance is 31.95 m. The new elevation is </w:t>
       </w:r>
       <w:r>
         <w:rPr>
@@ -2456,20 +2337,47 @@
           <w:sz w:val="22"/>
           <w:szCs w:val="22"/>
         </w:rPr>
-        <w:t xml:space="preserve">11.70°</w:t>
-      </w:r>
-      <w:r>
-        <w:rPr>
-          <w:rFonts w:ascii="Arial" w:cs="Arial" w:eastAsia="Arial" w:hAnsi="Arial"/>
-          <w:b w:val="false"/>
-          <w:bCs w:val="false"/>
-          <w:i w:val="false"/>
-          <w:iCs w:val="false"/>
-          <w:color w:val="222222"/>
-          <w:sz w:val="22"/>
-          <w:szCs w:val="22"/>
-        </w:rPr>
-        <w:t xml:space="preserve"> and direction </w:t>
+        <w:t xml:space="preserve">7.40°</w:t>
+      </w:r>
+      <w:r>
+        <w:rPr>
+          <w:rFonts w:ascii="Arial" w:cs="Arial" w:eastAsia="Arial" w:hAnsi="Arial"/>
+          <w:b w:val="false"/>
+          <w:bCs w:val="false"/>
+          <w:i w:val="false"/>
+          <w:iCs w:val="false"/>
+          <w:color w:val="222222"/>
+          <w:sz w:val="22"/>
+          <w:szCs w:val="22"/>
+        </w:rPr>
+        <w:t xml:space="preserve"> and the direction is tan</w:t>
+      </w:r>
+      <w:r>
+        <w:rPr>
+          <w:rFonts w:ascii="Arial" w:cs="Arial" w:eastAsia="Arial" w:hAnsi="Arial"/>
+          <w:b w:val="false"/>
+          <w:bCs w:val="false"/>
+          <w:i w:val="false"/>
+          <w:iCs w:val="false"/>
+          <w:color w:val="222222"/>
+          <w:sz w:val="22"/>
+          <w:szCs w:val="22"/>
+          <w:vertAlign w:val="superscript"/>
+        </w:rPr>
+        <w:t xml:space="preserve">−1</w:t>
+      </w:r>
+      <w:r>
+        <w:rPr>
+          <w:rFonts w:ascii="Arial" w:cs="Arial" w:eastAsia="Arial" w:hAnsi="Arial"/>
+          <w:b w:val="false"/>
+          <w:bCs w:val="false"/>
+          <w:i w:val="false"/>
+          <w:iCs w:val="false"/>
+          <w:color w:val="222222"/>
+          <w:sz w:val="22"/>
+          <w:szCs w:val="22"/>
+        </w:rPr>
+        <w:t xml:space="preserve">(16.98 / 27.06) = </w:t>
       </w:r>
       <w:r>
         <w:rPr>
@@ -2482,20 +2390,20 @@
           <w:sz w:val="22"/>
           <w:szCs w:val="22"/>
         </w:rPr>
-        <w:t xml:space="preserve">31.46°</w:t>
-      </w:r>
-      <w:r>
-        <w:rPr>
-          <w:rFonts w:ascii="Arial" w:cs="Arial" w:eastAsia="Arial" w:hAnsi="Arial"/>
-          <w:b w:val="false"/>
-          <w:bCs w:val="false"/>
-          <w:i w:val="false"/>
-          <w:iCs w:val="false"/>
-          <w:color w:val="222222"/>
-          <w:sz w:val="22"/>
-          <w:szCs w:val="22"/>
-        </w:rPr>
-        <w:t xml:space="preserve">. Those angles hit Blue.</w:t>
+        <w:t xml:space="preserve">32.11°</w:t>
+      </w:r>
+      <w:r>
+        <w:rPr>
+          <w:rFonts w:ascii="Arial" w:cs="Arial" w:eastAsia="Arial" w:hAnsi="Arial"/>
+          <w:b w:val="false"/>
+          <w:bCs w:val="false"/>
+          <w:i w:val="false"/>
+          <w:iCs w:val="false"/>
+          <w:color w:val="222222"/>
+          <w:sz w:val="22"/>
+          <w:szCs w:val="22"/>
+        </w:rPr>
+        <w:t xml:space="preserve">. Both differences are positive, so do not add 180°. That first pass is about 0.20 m off Blue, inside the 1 m window, so those two angles hit.</w:t>
       </w:r>
     </w:p>
     <w:sectPr>

</xml_diff>